<commit_message>
docs: add the authors' ORCID iDs and rebuild the Overleaf package
The previous paper1_overleaf.zip was built before the last style edits,
so it still had the URL placeholder. It now matches latex/ exactly.
The readable PDF and the Word file no longer print \url, accent codes
or \interlinepenalty literally.

Co-Authored-By: Claude Opus 5.5 <noreply@anthropic.com>
</commit_message>
<xml_diff>
--- a/08_final_submission/final_paper.docx
+++ b/08_final_submission/final_paper.docx
@@ -4942,7 +4942,19 @@
       </w:pPr>
       <w:r>
         <w:rPr/>
-        <w:t xml:space="preserve">The procedure records are public, were collected without logging in (Sec. 3) and contain no personal data. The citizen questions come from public datasets whose cards state no license; personal data were masked before labeling, no names or identifiers appear in this paper, and no data were collected from human participants, so no ethics approval was required. We use them only for evaluation and do not redistribute the question texts. The code, the locked question identifiers and hashes, the labels and the per-question decisions of every run are at \url{https://github.com/3-hWnG/intern-amazing-group_7/tree/paper1-vjcs-draft}; each identifier maps to a row of the original datasets, and the full commit history is available to reviewers on request. </w:t>
+        <w:t xml:space="preserve">The procedure records are public, were collected without logging in (Sec. 3) and contain no personal data. The citizen questions come from public datasets whose cards state no license; personal data were masked before labeling, no names or identifiers appear in this paper, and no data were collected from human participants, so no ethics approval was required. We use them only for evaluation and do not redistribute the question texts. The code, the locked question identifiers and hashes, the labels and the per-question decisions of every run are at </w:t>
+      </w:r>
+      <w:hyperlink r:id="rId2">
+        <w:r>
+          <w:rPr>
+            <w:rStyle w:val="Hyperlink"/>
+          </w:rPr>
+          <w:t>https://github.com/3-hWnG/intern-amazing-group_7/tree/paper1-vjcs-draft</w:t>
+        </w:r>
+      </w:hyperlink>
+      <w:r>
+        <w:rPr/>
+        <w:t xml:space="preserve">; each identifier maps to a row of the original datasets, and the full commit history is available to reviewers on request. </w:t>
       </w:r>
     </w:p>
     <w:p>
@@ -5031,28 +5043,53 @@
         <w:pStyle w:val="BodyText"/>
         <w:bidi w:val="0"/>
         <w:ind w:hanging="0" w:left="0" w:right="0"/>
-        <w:rPr/>
-      </w:pPr>
-      <w:r>
-        <w:rPr>
-          <w:color w:val="CC0000"/>
-        </w:rPr>
-        <w:t>[TODO: ORCID iDs of all authors.]</w:t>
-      </w:r>
+        <w:jc w:val="left"/>
+        <w:rPr/>
+      </w:pPr>
+      <w:r>
+        <w:rPr/>
+        <w:t>Trinh Hoang Nhan</w:t>
+        <w:br/>
+      </w:r>
+      <w:hyperlink r:id="rId3">
+        <w:r>
+          <w:rPr>
+            <w:rStyle w:val="Hyperlink"/>
+          </w:rPr>
+          <w:t>https://orcid.org/0009-0003-1961-9022</w:t>
+        </w:r>
+      </w:hyperlink>
+      <w:r>
+        <w:rPr/>
+        <w:br/>
+        <w:t>Nguyen Viet Hung</w:t>
+        <w:br/>
+      </w:r>
+      <w:hyperlink r:id="rId4">
+        <w:r>
+          <w:rPr>
+            <w:rStyle w:val="Hyperlink"/>
+          </w:rPr>
+          <w:t>https://orcid.org/0009-0006-5603-6143</w:t>
+        </w:r>
+      </w:hyperlink>
+      <w:r>
+        <w:rPr/>
+        <w:br/>
+        <w:t>Pham Le Thien Dan</w:t>
+        <w:br/>
+      </w:r>
+      <w:hyperlink r:id="rId5">
+        <w:r>
+          <w:rPr>
+            <w:rStyle w:val="Hyperlink"/>
+          </w:rPr>
+          <w:t>https://orcid.org/0009-0006-3191-0965</w:t>
+        </w:r>
+      </w:hyperlink>
       <w:r>
         <w:rPr/>
         <w:t xml:space="preserve"> </w:t>
-      </w:r>
-    </w:p>
-    <w:p>
-      <w:pPr>
-        <w:pStyle w:val="BodyText"/>
-        <w:bidi w:val="0"/>
-        <w:rPr/>
-      </w:pPr>
-      <w:r>
-        <w:rPr/>
-        <w:t xml:space="preserve">\interlinepenalty=10000 </w:t>
       </w:r>
     </w:p>
     <w:p>
@@ -5089,7 +5126,7 @@
         <w:rPr>
           <w:sz w:val="18"/>
         </w:rPr>
-        <w:t>Government of Vietnam, “National Public Service Portal”, 2026, \urlhttps://dichvucong.gov.vn, procedure records collected 13 October 2026.</w:t>
+        <w:t>Government of Vietnam, “National Public Service Portal”, 2026, https://dichvucong.gov.vn, procedure records collected 13 October 2026.</w:t>
       </w:r>
     </w:p>
     <w:p>
@@ -5139,7 +5176,7 @@
         <w:rPr>
           <w:sz w:val="18"/>
         </w:rPr>
-        <w:t>L. Samson and I. Gornishka and G. Lô and Y. M. Asano and S. Ghebreab, “From Values to Benchmarks: Evaluating Large Language Models for Governmental Use in Dutch”, 2026, arXiv:2608.09925.</w:t>
+        <w:t>L. Samson, I. Gornishka, G. Lô, Y. M. Asano and S. Ghebreab, “From Values to Benchmarks: Evaluating Large Language Models for Governmental Use in Dutch”, 2026, arXiv:2608.09925.</w:t>
       </w:r>
     </w:p>
     <w:p>
@@ -5164,7 +5201,7 @@
         <w:rPr>
           <w:sz w:val="18"/>
         </w:rPr>
-        <w:t xml:space="preserve">B. Wen and J. Yao and S. Feng and C. Xu and Y. Tsvetkov and B. Howe and L. L. Wang, “Know Your Limits: A Survey of Abstention in Large Language Models”, </w:t>
+        <w:t xml:space="preserve">B. Wen, J. Yao, S. Feng, C. Xu, Y. Tsvetkov, B. Howe and L. L. Wang, “Know Your Limits: A Survey of Abstention in Large Language Models”, </w:t>
       </w:r>
       <w:r>
         <w:rPr>
@@ -5202,7 +5239,7 @@
         <w:rPr>
           <w:sz w:val="18"/>
         </w:rPr>
-        <w:t xml:space="preserve">A. Kamath and R. Jia and P. Liang, “Selective Question Answering under Domain Shift”, </w:t>
+        <w:t xml:space="preserve">A. Kamath, R. Jia and P. Liang, “Selective Question Answering under Domain Shift”, </w:t>
       </w:r>
       <w:r>
         <w:rPr>
@@ -5240,7 +5277,7 @@
         <w:rPr>
           <w:sz w:val="18"/>
         </w:rPr>
-        <w:t xml:space="preserve">S. Larson and A. Mahendran and J. J. Peper and C. Clarke and A. Lee and P. Hill and J. K. Kummerfeld and K. Leach and M. A. Laurenzano and L. Tang and J. Mars, “An Evaluation Dataset for Intent Classification and Out-of-Scope Prediction”, </w:t>
+        <w:t xml:space="preserve">S. Larson, A. Mahendran, J. J. Peper, C. Clarke, A. Lee, P. Hill, J. K. Kummerfeld, K. Leach, M. A. Laurenzano, L. Tang and J. Mars, “An Evaluation Dataset for Intent Classification and Out-of-Scope Prediction”, </w:t>
       </w:r>
       <w:r>
         <w:rPr>
@@ -5278,7 +5315,7 @@
         <w:rPr>
           <w:sz w:val="18"/>
         </w:rPr>
-        <w:t xml:space="preserve">Pham Duy, A. and Le Thanh, H., “A Question-Answering System for Vietnamese Public Administrative Services”, </w:t>
+        <w:t xml:space="preserve">A. Pham Duy and H. Le Thanh, “A Question-Answering System for Vietnamese Public Administrative Services”, </w:t>
       </w:r>
       <w:r>
         <w:rPr>
@@ -5316,7 +5353,7 @@
         <w:rPr>
           <w:sz w:val="18"/>
         </w:rPr>
-        <w:t>D. M. Jimenez-Gutierrez and A. Cirillo and R. Nicolussi and A. Beltrame and A. Vitaletti, “GuidaPA: Privacy-Preserving Chatbot for Public Administration via Federated Learning”, 2026, arXiv:2606.01386.</w:t>
+        <w:t>D. M. Jimenez-Gutierrez, A. Cirillo, R. Nicolussi, A. Beltrame and A. Vitaletti, “GuidaPA: Privacy-Preserving Chatbot for Public Administration via Federated Learning”, 2026, arXiv:2606.01386.</w:t>
       </w:r>
     </w:p>
     <w:p>
@@ -5341,7 +5378,7 @@
         <w:rPr>
           <w:sz w:val="18"/>
         </w:rPr>
-        <w:t xml:space="preserve">M.-T. Nguyen and K.-T. Tran and N. V. Nguyen and X.-S. Vu, “ViGPTQA – State-of-the-Art LLMs for Vietnamese Question Answering: System Overview, Core Models Training, and Evaluations”, </w:t>
+        <w:t xml:space="preserve">M.-T. Nguyen, K.-T. Tran, N. V. Nguyen and X.-S. Vu, “ViGPTQA – State-of-the-Art LLMs for Vietnamese Question Answering: System Overview, Core Models Training, and Evaluations”, </w:t>
       </w:r>
       <w:r>
         <w:rPr>
@@ -5379,7 +5416,7 @@
         <w:rPr>
           <w:sz w:val="18"/>
         </w:rPr>
-        <w:t xml:space="preserve">P. T. X. Hien and D. N. T. Nhi and P. T. N. Huyen, “Integrating Information Retrieval and Large Language Models for Vietnamese Legal Document Query Systems”, </w:t>
+        <w:t xml:space="preserve">P. T. X. Hien, D. N. T. Nhi and P. T. N. Huyen, “Integrating Information Retrieval and Large Language Models for Vietnamese Legal Document Query Systems”, </w:t>
       </w:r>
       <w:r>
         <w:rPr>
@@ -5455,7 +5492,7 @@
         <w:rPr>
           <w:sz w:val="18"/>
         </w:rPr>
-        <w:t xml:space="preserve">P. Rajpurkar and R. Jia and P. Liang, “Know What You Don't Know: Unanswerable Questions for SQuAD”, </w:t>
+        <w:t xml:space="preserve">P. Rajpurkar, R. Jia and P. Liang, “Know What You Don't Know: Unanswerable Questions for SQuAD”, </w:t>
       </w:r>
       <w:r>
         <w:rPr>
@@ -5493,7 +5530,7 @@
         <w:rPr>
           <w:sz w:val="18"/>
         </w:rPr>
-        <w:t xml:space="preserve">M. Aliannejadi and H. Zamani and F. Crestani and W. B. Croft, “Asking Clarifying Questions in Open-Domain Information-Seeking Conversations”, </w:t>
+        <w:t xml:space="preserve">M. Aliannejadi, H. Zamani, F. Crestani and W. B. Croft, “Asking Clarifying Questions in Open-Domain Information-Seeking Conversations”, </w:t>
       </w:r>
       <w:r>
         <w:rPr>
@@ -5531,7 +5568,7 @@
         <w:rPr>
           <w:sz w:val="18"/>
         </w:rPr>
-        <w:t xml:space="preserve">P. Lewis and E. Perez and A. Piktus and F. Petroni and V. Karpukhin and N. Goyal and H. K\"uttler and M. Lewis and Yih, Wen-tau and T. Rockt\"aschel and S. Riedel and D. Kiela, “Retrieval-Augmented Generation for Knowledge-Intensive NLP Tasks”, </w:t>
+        <w:t xml:space="preserve">P. Lewis, E. Perez, A. Piktus, F. Petroni, V. Karpukhin, N. Goyal, H. Küttler, M. Lewis, Wen-tau Yih, T. Rocktäschel, S. Riedel and D. Kiela, “Retrieval-Augmented Generation for Knowledge-Intensive NLP Tasks”, </w:t>
       </w:r>
       <w:r>
         <w:rPr>
@@ -5569,7 +5606,7 @@
         <w:rPr>
           <w:sz w:val="18"/>
         </w:rPr>
-        <w:t xml:space="preserve">A. Asai and Z. Wu and Y. Wang and A. Sil and H. Hajishirzi, “Self-RAG: Learning to Retrieve, Generate, and Critique through Self-Reflection”, </w:t>
+        <w:t xml:space="preserve">A. Asai, Z. Wu, Y. Wang, A. Sil and H. Hajishirzi, “Self-RAG: Learning to Retrieve, Generate, and Critique through Self-Reflection”, </w:t>
       </w:r>
       <w:r>
         <w:rPr>
@@ -5607,7 +5644,7 @@
         <w:rPr>
           <w:sz w:val="18"/>
         </w:rPr>
-        <w:t>S.-Q. Yan and J.-C. Gu and Y. Zhu and Z.-H. Ling, “Corrective Retrieval Augmented Generation”, 2024, arXiv:2401.15884.</w:t>
+        <w:t>S.-Q. Yan, J.-C. Gu, Y. Zhu and Z.-H. Ling, “Corrective Retrieval Augmented Generation”, 2024, arXiv:2401.15884.</w:t>
       </w:r>
     </w:p>
     <w:p>
@@ -5632,7 +5669,7 @@
         <w:rPr>
           <w:sz w:val="18"/>
         </w:rPr>
-        <w:t xml:space="preserve">T. Rebedea and R. Dinu and M. N. Sreedhar and C. Parisien and J. Cohen, “NeMo Guardrails: A Toolkit for Controllable and Safe LLM Applications with Programmable Rails”, </w:t>
+        <w:t xml:space="preserve">T. Rebedea, R. Dinu, M. N. Sreedhar, C. Parisien and J. Cohen, “NeMo Guardrails: A Toolkit for Controllable and Safe LLM Applications with Programmable Rails”, </w:t>
       </w:r>
       <w:r>
         <w:rPr>
@@ -5670,7 +5707,7 @@
         <w:rPr>
           <w:sz w:val="18"/>
         </w:rPr>
-        <w:t xml:space="preserve">F. Gilardi and M. Alizadeh and M. Kubli, “ChatGPT Outperforms Crowd Workers for Text-Annotation Tasks”, </w:t>
+        <w:t xml:space="preserve">F. Gilardi, M. Alizadeh and M. Kubli, “ChatGPT Outperforms Crowd Workers for Text-Annotation Tasks”, </w:t>
       </w:r>
       <w:r>
         <w:rPr>
@@ -5708,7 +5745,7 @@
         <w:rPr>
           <w:sz w:val="18"/>
         </w:rPr>
-        <w:t>hieunguyen1053, “dichvucong_faqs (config hoi-dap), Hugging Face dataset”, 2026, \urlhttps://huggingface.co/datasets/hieunguyen1053/dichvucong_faqs, accessed 18 October 2026.</w:t>
+        <w:t>hieunguyen1053, “dichvucong_faqs (config hoi-dap), Hugging Face dataset”, 2026, https://huggingface.co/datasets/hieunguyen1053/dichvucong_faqs, accessed 18 October 2026.</w:t>
       </w:r>
     </w:p>
     <w:p>
@@ -5733,7 +5770,7 @@
         <w:rPr>
           <w:sz w:val="18"/>
         </w:rPr>
-        <w:t>doanhieung, “vn-mps-public-service-qa, Hugging Face dataset”, 2026, \urlhttps://huggingface.co/datasets/doanhieung/vn-mps-public-service-qa, accessed 18 October 2026.</w:t>
+        <w:t>doanhieung, “vn-mps-public-service-qa, Hugging Face dataset”, 2026, https://huggingface.co/datasets/doanhieung/vn-mps-public-service-qa, accessed 18 October 2026.</w:t>
       </w:r>
     </w:p>
     <w:p>
@@ -5796,7 +5833,7 @@
         <w:rPr>
           <w:sz w:val="18"/>
         </w:rPr>
-        <w:t xml:space="preserve">J. Chen and S. Xiao and P. Zhang and K. Luo and D. Lian and Z. Liu, “M3-Embedding: Multi-Linguality, Multi-Functionality, Multi-Granularity Text Embeddings Through Self-Knowledge Distillation”, </w:t>
+        <w:t xml:space="preserve">J. Chen, S. Xiao, P. Zhang, K. Luo, D. Lian and Z. Liu, “M3-Embedding: Multi-Linguality, Multi-Functionality, Multi-Granularity Text Embeddings Through Self-Knowledge Distillation”, </w:t>
       </w:r>
       <w:r>
         <w:rPr>
@@ -5834,7 +5871,7 @@
         <w:rPr>
           <w:sz w:val="18"/>
         </w:rPr>
-        <w:t>BAAI, “bge-reranker-v2-m3, model card”, 2024, \urlhttps://huggingface.co/BAAI/bge-reranker-v2-m3, accessed 25 October 2026.</w:t>
+        <w:t>BAAI, “bge-reranker-v2-m3, model card”, 2024, https://huggingface.co/BAAI/bge-reranker-v2-m3, accessed 25 October 2026.</w:t>
       </w:r>
     </w:p>
     <w:p>
@@ -5884,7 +5921,7 @@
         <w:rPr>
           <w:sz w:val="18"/>
         </w:rPr>
-        <w:t>Qwen Team, “Qwen3-4B-Instruct-2507, model card”, 2025, \urlhttps://huggingface.co/Qwen/Qwen3-4B-Instruct-2507, accessed 25 October 2026.</w:t>
+        <w:t>Qwen Team, “Qwen3-4B-Instruct-2507, model card”, 2025, https://huggingface.co/Qwen/Qwen3-4B-Instruct-2507, accessed 25 October 2026.</w:t>
       </w:r>
     </w:p>
     <w:p>
@@ -5909,7 +5946,7 @@
         <w:rPr>
           <w:sz w:val="18"/>
         </w:rPr>
-        <w:t xml:space="preserve">C. Dwork and V. Feldman and M. Hardt and T. Pitassi and O. Reingold and A. Roth, “The Reusable Holdout: Preserving Validity in Adaptive Data Analysis”, </w:t>
+        <w:t xml:space="preserve">C. Dwork, V. Feldman, M. Hardt, T. Pitassi, O. Reingold and A. Roth, “The Reusable Holdout: Preserving Validity in Adaptive Data Analysis”, </w:t>
       </w:r>
       <w:r>
         <w:rPr>
@@ -5947,7 +5984,7 @@
         <w:rPr>
           <w:sz w:val="18"/>
         </w:rPr>
-        <w:t xml:space="preserve">K. H. Brodersen and C. S. Ong and K. E. Stephan and J. M. Buhmann, “The Balanced Accuracy and Its Posterior Distribution”, </w:t>
+        <w:t xml:space="preserve">K. H. Brodersen, C. S. Ong, K. E. Stephan and J. M. Buhmann, “The Balanced Accuracy and Its Posterior Distribution”, </w:t>
       </w:r>
       <w:r>
         <w:rPr>
@@ -6677,6 +6714,13 @@
     <w:qFormat/>
     <w:rPr>
       <w:rFonts w:ascii="OpenSymbol" w:hAnsi="OpenSymbol" w:eastAsia="OpenSymbol" w:cs="OpenSymbol"/>
+    </w:rPr>
+  </w:style>
+  <w:style w:type="character" w:styleId="Hyperlink">
+    <w:name w:val="Hyperlink"/>
+    <w:rPr>
+      <w:color w:val="000080"/>
+      <w:u w:val="single"/>
     </w:rPr>
   </w:style>
   <w:style w:type="character" w:styleId="NumberingSymbols">

</xml_diff>